<commit_message>
Resource requirements in documentation
</commit_message>
<xml_diff>
--- a/Documentation assets/shift_&_add_multiplier_documentation.docx
+++ b/Documentation assets/shift_&_add_multiplier_documentation.docx
@@ -2156,8 +2156,6 @@
       <w:r>
         <w:t xml:space="preserve"> Végül leteszteltük a futásidőben engedélyezhető megszakításkérést.</w:t>
       </w:r>
-      <w:bookmarkStart w:id="1" w:name="_GoBack"/>
-      <w:bookmarkEnd w:id="1"/>
     </w:p>
     <w:p>
       <w:pPr>
@@ -2293,6 +2291,10 @@
         <w:keepNext/>
       </w:pPr>
       <w:r>
+        <w:rPr>
+          <w:noProof/>
+          <w:lang w:eastAsia="hu-HU"/>
+        </w:rPr>
         <w:drawing>
           <wp:inline distT="0" distB="0" distL="0" distR="0" wp14:anchorId="04DA95AE" wp14:editId="29EEE0DC">
             <wp:extent cx="5759450" cy="273050"/>
@@ -2386,16 +2388,207 @@
       </w:r>
       <w:proofErr w:type="spellEnd"/>
       <w:r>
-        <w:t xml:space="preserve"> Design-t az időzítésvizsgálat alapján a maximális órajelfrekvencia 139.31MHz, ez megfelel az 50MHz-es </w:t>
+        <w:t xml:space="preserve"> Design-t az időzítésvizsgálat alapján </w:t>
+      </w:r>
+      <w:r>
+        <w:t>a maximális órajelfrekvencia 130.79</w:t>
+      </w:r>
+      <w:r>
+        <w:t xml:space="preserve">MHz, ez megfelel </w:t>
+      </w:r>
+      <w:r>
+        <w:t>az 50MHz-es specifikác</w:t>
+      </w:r>
+      <w:r>
+        <w:t>iónak.</w:t>
+      </w:r>
+    </w:p>
+    <w:p>
+      <w:pPr>
+        <w:jc w:val="center"/>
+      </w:pPr>
+      <w:r>
+        <w:drawing>
+          <wp:inline distT="0" distB="0" distL="0" distR="0" wp14:anchorId="65A82D11" wp14:editId="7FD5D09F">
+            <wp:extent cx="2991267" cy="590632"/>
+            <wp:effectExtent l="0" t="0" r="0" b="0"/>
+            <wp:docPr id="4" name="Kép 4"/>
+            <wp:cNvGraphicFramePr>
+              <a:graphicFrameLocks xmlns:a="http://schemas.openxmlformats.org/drawingml/2006/main" noChangeAspect="1"/>
+            </wp:cNvGraphicFramePr>
+            <a:graphic xmlns:a="http://schemas.openxmlformats.org/drawingml/2006/main">
+              <a:graphicData uri="http://schemas.openxmlformats.org/drawingml/2006/picture">
+                <pic:pic xmlns:pic="http://schemas.openxmlformats.org/drawingml/2006/picture">
+                  <pic:nvPicPr>
+                    <pic:cNvPr id="1" name=""/>
+                    <pic:cNvPicPr/>
+                  </pic:nvPicPr>
+                  <pic:blipFill>
+                    <a:blip r:embed="rId16"/>
+                    <a:stretch>
+                      <a:fillRect/>
+                    </a:stretch>
+                  </pic:blipFill>
+                  <pic:spPr>
+                    <a:xfrm>
+                      <a:off x="0" y="0"/>
+                      <a:ext cx="2991267" cy="590632"/>
+                    </a:xfrm>
+                    <a:prstGeom prst="rect">
+                      <a:avLst/>
+                    </a:prstGeom>
+                  </pic:spPr>
+                </pic:pic>
+              </a:graphicData>
+            </a:graphic>
+          </wp:inline>
+        </w:drawing>
+      </w:r>
+    </w:p>
+    <w:p>
+      <w:r>
+        <w:t>A szintézis alapján az áramkör megvalósításához az alábbi erőforrásokra van szükség:</w:t>
+      </w:r>
+    </w:p>
+    <w:p>
+      <w:pPr>
+        <w:jc w:val="center"/>
+      </w:pPr>
+      <w:r>
+        <w:drawing>
+          <wp:inline distT="0" distB="0" distL="0" distR="0" wp14:anchorId="0822A33B" wp14:editId="33DCC283">
+            <wp:extent cx="2867425" cy="781159"/>
+            <wp:effectExtent l="0" t="0" r="9525" b="0"/>
+            <wp:docPr id="7" name="Kép 7"/>
+            <wp:cNvGraphicFramePr>
+              <a:graphicFrameLocks xmlns:a="http://schemas.openxmlformats.org/drawingml/2006/main" noChangeAspect="1"/>
+            </wp:cNvGraphicFramePr>
+            <a:graphic xmlns:a="http://schemas.openxmlformats.org/drawingml/2006/main">
+              <a:graphicData uri="http://schemas.openxmlformats.org/drawingml/2006/picture">
+                <pic:pic xmlns:pic="http://schemas.openxmlformats.org/drawingml/2006/picture">
+                  <pic:nvPicPr>
+                    <pic:cNvPr id="1" name=""/>
+                    <pic:cNvPicPr/>
+                  </pic:nvPicPr>
+                  <pic:blipFill>
+                    <a:blip r:embed="rId17"/>
+                    <a:stretch>
+                      <a:fillRect/>
+                    </a:stretch>
+                  </pic:blipFill>
+                  <pic:spPr>
+                    <a:xfrm>
+                      <a:off x="0" y="0"/>
+                      <a:ext cx="2867425" cy="781159"/>
+                    </a:xfrm>
+                    <a:prstGeom prst="rect">
+                      <a:avLst/>
+                    </a:prstGeom>
+                  </pic:spPr>
+                </pic:pic>
+              </a:graphicData>
+            </a:graphic>
+          </wp:inline>
+        </w:drawing>
+      </w:r>
+    </w:p>
+    <w:p>
+      <w:pPr>
+        <w:jc w:val="both"/>
+      </w:pPr>
+      <w:r>
+        <w:lastRenderedPageBreak/>
+        <w:t xml:space="preserve">Az ACU rendszerbe való integrálást követően szintetizálhatjuk a teljes rendszert. A lehelyezést követően az alaprendszer (CPU, </w:t>
       </w:r>
       <w:proofErr w:type="spellStart"/>
       <w:r>
-        <w:t>specifikáziónak</w:t>
+        <w:t>scratchpad</w:t>
       </w:r>
       <w:proofErr w:type="spellEnd"/>
       <w:r>
-        <w:t>.</w:t>
-      </w:r>
+        <w:t xml:space="preserve"> RAM, megszakításvezérlő, </w:t>
+      </w:r>
+      <w:proofErr w:type="spellStart"/>
+      <w:r>
+        <w:t>debug</w:t>
+      </w:r>
+      <w:proofErr w:type="spellEnd"/>
+      <w:r>
+        <w:t xml:space="preserve"> GPIO és </w:t>
+      </w:r>
+      <w:proofErr w:type="spellStart"/>
+      <w:r>
+        <w:t>debug</w:t>
+      </w:r>
+      <w:proofErr w:type="spellEnd"/>
+      <w:r>
+        <w:t xml:space="preserve"> UART)</w:t>
+      </w:r>
+      <w:r>
+        <w:t xml:space="preserve"> a feketével</w:t>
+      </w:r>
+      <w:bookmarkStart w:id="1" w:name="_GoBack"/>
+      <w:bookmarkEnd w:id="1"/>
+      <w:r>
+        <w:t>, a szorzómodul a sárga színnel jelölt blokkokban került megvalósításra:</w:t>
+      </w:r>
+    </w:p>
+    <w:p>
+      <w:pPr>
+        <w:jc w:val="center"/>
+      </w:pPr>
+      <w:r>
+        <w:rPr>
+          <w:noProof/>
+          <w:lang w:eastAsia="hu-HU"/>
+        </w:rPr>
+        <w:drawing>
+          <wp:inline distT="0" distB="0" distL="0" distR="0" wp14:anchorId="6EA0D864" wp14:editId="31269F98">
+            <wp:extent cx="2166452" cy="3467100"/>
+            <wp:effectExtent l="0" t="0" r="5715" b="0"/>
+            <wp:docPr id="9" name="Kép 9"/>
+            <wp:cNvGraphicFramePr>
+              <a:graphicFrameLocks xmlns:a="http://schemas.openxmlformats.org/drawingml/2006/main" noChangeAspect="1"/>
+            </wp:cNvGraphicFramePr>
+            <a:graphic xmlns:a="http://schemas.openxmlformats.org/drawingml/2006/main">
+              <a:graphicData uri="http://schemas.openxmlformats.org/drawingml/2006/picture">
+                <pic:pic xmlns:pic="http://schemas.openxmlformats.org/drawingml/2006/picture">
+                  <pic:nvPicPr>
+                    <pic:cNvPr id="9" name="03_SHMUL_merged.png"/>
+                    <pic:cNvPicPr/>
+                  </pic:nvPicPr>
+                  <pic:blipFill>
+                    <a:blip r:embed="rId18" cstate="print">
+                      <a:extLst>
+                        <a:ext uri="{28A0092B-C50C-407E-A947-70E740481C1C}">
+                          <a14:useLocalDpi xmlns:a14="http://schemas.microsoft.com/office/drawing/2010/main" val="0"/>
+                        </a:ext>
+                      </a:extLst>
+                    </a:blip>
+                    <a:stretch>
+                      <a:fillRect/>
+                    </a:stretch>
+                  </pic:blipFill>
+                  <pic:spPr>
+                    <a:xfrm>
+                      <a:off x="0" y="0"/>
+                      <a:ext cx="2171643" cy="3475408"/>
+                    </a:xfrm>
+                    <a:prstGeom prst="rect">
+                      <a:avLst/>
+                    </a:prstGeom>
+                  </pic:spPr>
+                </pic:pic>
+              </a:graphicData>
+            </a:graphic>
+          </wp:inline>
+        </w:drawing>
+      </w:r>
+    </w:p>
+    <w:p>
+      <w:pPr>
+        <w:jc w:val="both"/>
+      </w:pPr>
     </w:p>
     <w:sectPr>
       <w:pgSz w:w="11906" w:h="16838"/>
@@ -3989,7 +4182,7 @@
 </file>
 
 <file path=customXml/itemProps1.xml><?xml version="1.0" encoding="utf-8"?>
-<ds:datastoreItem xmlns:ds="http://schemas.openxmlformats.org/officeDocument/2006/customXml" ds:itemID="{049FC5AA-06E4-4F3A-A56D-4C0D4C7BCD84}">
+<ds:datastoreItem xmlns:ds="http://schemas.openxmlformats.org/officeDocument/2006/customXml" ds:itemID="{16747A72-C665-4C34-AF66-B1B8E877AB1A}">
   <ds:schemaRefs>
     <ds:schemaRef ds:uri="http://schemas.openxmlformats.org/officeDocument/2006/bibliography"/>
   </ds:schemaRefs>

</xml_diff>